<commit_message>
Pridaná titulná strana v dokumentácii
</commit_message>
<xml_diff>
--- a/dokumentacia_1etapa.docx
+++ b/dokumentacia_1etapa.docx
@@ -2,9 +2,252 @@
 <file path=word/document.xml><?xml version="1.0" encoding="utf-8"?>
 <w:document xmlns:wpc="http://schemas.microsoft.com/office/word/2010/wordprocessingCanvas" xmlns:cx="http://schemas.microsoft.com/office/drawing/2014/chartex" xmlns:cx1="http://schemas.microsoft.com/office/drawing/2015/9/8/chartex" xmlns:cx2="http://schemas.microsoft.com/office/drawing/2015/10/21/chartex" xmlns:cx3="http://schemas.microsoft.com/office/drawing/2016/5/9/chartex" xmlns:cx4="http://schemas.microsoft.com/office/drawing/2016/5/10/chartex" xmlns:cx5="http://schemas.microsoft.com/office/drawing/2016/5/11/chartex" xmlns:cx6="http://schemas.microsoft.com/office/drawing/2016/5/12/chartex" xmlns:cx7="http://schemas.microsoft.com/office/drawing/2016/5/13/chartex" xmlns:cx8="http://schemas.microsoft.com/office/drawing/2016/5/14/chartex" xmlns:mc="http://schemas.openxmlformats.org/markup-compatibility/2006" xmlns:aink="http://schemas.microsoft.com/office/drawing/2016/ink" xmlns:am3d="http://schemas.microsoft.com/office/drawing/2017/model3d" xmlns:o="urn:schemas-microsoft-com:office:office" xmlns:oel="http://schemas.microsoft.com/office/2019/extlst" xmlns:r="http://schemas.openxmlformats.org/officeDocument/2006/relationships" xmlns:m="http://schemas.openxmlformats.org/officeDocument/2006/math" xmlns:v="urn:schemas-microsoft-com:vml" xmlns:wp14="http://schemas.microsoft.com/office/word/2010/wordprocessingDrawing" xmlns:wp="http://schemas.openxmlformats.org/drawingml/2006/wordprocessingDrawing" xmlns:w10="urn:schemas-microsoft-com:office:word" xmlns:w="http://schemas.openxmlformats.org/wordprocessingml/2006/main" xmlns:w14="http://schemas.microsoft.com/office/word/2010/wordml" xmlns:w15="http://schemas.microsoft.com/office/word/2012/wordml" xmlns:w16cex="http://schemas.microsoft.com/office/word/2018/wordml/cex" xmlns:w16cid="http://schemas.microsoft.com/office/word/2016/wordml/cid" xmlns:w16="http://schemas.microsoft.com/office/word/2018/wordml" xmlns:w16du="http://schemas.microsoft.com/office/word/2023/wordml/word16du" xmlns:w16sdtdh="http://schemas.microsoft.com/office/word/2020/wordml/sdtdatahash" xmlns:w16sdtfl="http://schemas.microsoft.com/office/word/2024/wordml/sdtformatlock" xmlns:w16se="http://schemas.microsoft.com/office/word/2015/wordml/symex" xmlns:wpg="http://schemas.microsoft.com/office/word/2010/wordprocessingGroup" xmlns:wpi="http://schemas.microsoft.com/office/word/2010/wordprocessingInk" xmlns:wne="http://schemas.microsoft.com/office/word/2006/wordml" xmlns:wps="http://schemas.microsoft.com/office/word/2010/wordprocessingShape" mc:Ignorable="w14 w15 w16se w16cid w16 w16cex w16sdtdh w16sdtfl w16du wp14">
   <w:body>
-    <w:p>
-      <w:pPr>
-        <w:pStyle w:val="Nzov"/>
+    <w:tbl>
+      <w:tblPr>
+        <w:tblStyle w:val="Mriekatabuky"/>
+        <w:tblW w:w="5055" w:type="pct"/>
+        <w:tblBorders>
+          <w:top w:val="none" w:sz="0" w:space="0" w:color="auto"/>
+          <w:left w:val="none" w:sz="0" w:space="0" w:color="auto"/>
+          <w:bottom w:val="none" w:sz="0" w:space="0" w:color="auto"/>
+          <w:right w:val="none" w:sz="0" w:space="0" w:color="auto"/>
+          <w:insideH w:val="none" w:sz="0" w:space="0" w:color="auto"/>
+          <w:insideV w:val="none" w:sz="0" w:space="0" w:color="auto"/>
+        </w:tblBorders>
+        <w:tblLook w:val="04A0" w:firstRow="1" w:lastRow="0" w:firstColumn="1" w:lastColumn="0" w:noHBand="0" w:noVBand="1"/>
+      </w:tblPr>
+      <w:tblGrid>
+        <w:gridCol w:w="2190"/>
+        <w:gridCol w:w="6935"/>
+      </w:tblGrid>
+      <w:tr>
+        <w:trPr>
+          <w:trHeight w:val="5330"/>
+        </w:trPr>
+        <w:tc>
+          <w:tcPr>
+            <w:tcW w:w="5000" w:type="pct"/>
+            <w:gridSpan w:val="2"/>
+          </w:tcPr>
+          <w:p>
+            <w:pPr>
+              <w:spacing w:line="259" w:lineRule="auto"/>
+              <w:jc w:val="center"/>
+              <w:rPr>
+                <w:b/>
+                <w:sz w:val="36"/>
+              </w:rPr>
+            </w:pPr>
+            <w:r>
+              <w:rPr>
+                <w:b/>
+                <w:sz w:val="36"/>
+              </w:rPr>
+              <w:t>TECHNICKÁ UNIVERZITA V KOŠICIACH</w:t>
+            </w:r>
+          </w:p>
+          <w:p>
+            <w:pPr>
+              <w:spacing w:line="259" w:lineRule="auto"/>
+              <w:jc w:val="center"/>
+              <w:rPr>
+                <w:caps/>
+                <w:sz w:val="32"/>
+                <w:szCs w:val="32"/>
+              </w:rPr>
+            </w:pPr>
+            <w:r>
+              <w:rPr>
+                <w:b/>
+                <w:sz w:val="30"/>
+                <w:szCs w:val="30"/>
+              </w:rPr>
+              <w:t>FAKULTA ELEKTROTECHNIKY A INFORMATIKY</w:t>
+            </w:r>
+            <w:r>
+              <w:rPr>
+                <w:b/>
+                <w:sz w:val="30"/>
+                <w:szCs w:val="30"/>
+              </w:rPr>
+              <w:t xml:space="preserve"> </w:t>
+            </w:r>
+          </w:p>
+          <w:p>
+            <w:pPr>
+              <w:spacing w:line="259" w:lineRule="auto"/>
+              <w:jc w:val="center"/>
+              <w:rPr>
+                <w:caps/>
+                <w:sz w:val="32"/>
+                <w:szCs w:val="32"/>
+              </w:rPr>
+            </w:pPr>
+          </w:p>
+        </w:tc>
+      </w:tr>
+      <w:tr>
+        <w:trPr>
+          <w:trHeight w:val="2161"/>
+        </w:trPr>
+        <w:tc>
+          <w:tcPr>
+            <w:tcW w:w="5000" w:type="pct"/>
+            <w:gridSpan w:val="2"/>
+            <w:vAlign w:val="center"/>
+          </w:tcPr>
+          <w:p>
+            <w:pPr>
+              <w:spacing w:line="259" w:lineRule="auto"/>
+              <w:jc w:val="center"/>
+              <w:rPr>
+                <w:b/>
+                <w:sz w:val="36"/>
+              </w:rPr>
+            </w:pPr>
+            <w:r>
+              <w:rPr>
+                <w:b/>
+                <w:sz w:val="36"/>
+              </w:rPr>
+              <w:t>Detekcia potravinových rizík</w:t>
+            </w:r>
+          </w:p>
+          <w:p>
+            <w:pPr>
+              <w:spacing w:line="259" w:lineRule="auto"/>
+              <w:jc w:val="center"/>
+              <w:rPr>
+                <w:sz w:val="32"/>
+                <w:szCs w:val="32"/>
+              </w:rPr>
+            </w:pPr>
+          </w:p>
+        </w:tc>
+      </w:tr>
+      <w:tr>
+        <w:trPr>
+          <w:trHeight w:val="4768"/>
+        </w:trPr>
+        <w:tc>
+          <w:tcPr>
+            <w:tcW w:w="5000" w:type="pct"/>
+            <w:gridSpan w:val="2"/>
+          </w:tcPr>
+          <w:p>
+            <w:pPr>
+              <w:spacing w:line="259" w:lineRule="auto"/>
+            </w:pPr>
+          </w:p>
+        </w:tc>
+      </w:tr>
+      <w:tr>
+        <w:trPr>
+          <w:trHeight w:val="652"/>
+        </w:trPr>
+        <w:tc>
+          <w:tcPr>
+            <w:tcW w:w="1200" w:type="pct"/>
+            <w:vAlign w:val="bottom"/>
+          </w:tcPr>
+          <w:p>
+            <w:pPr>
+              <w:spacing w:line="259" w:lineRule="auto"/>
+              <w:rPr>
+                <w:b/>
+              </w:rPr>
+            </w:pPr>
+            <w:r>
+              <w:rPr>
+                <w:b/>
+                <w:sz w:val="32"/>
+              </w:rPr>
+              <w:fldChar w:fldCharType="begin"/>
+            </w:r>
+            <w:r>
+              <w:rPr>
+                <w:b/>
+                <w:sz w:val="32"/>
+              </w:rPr>
+              <w:instrText xml:space="preserve"> DATE  \@ "yyyy"  \* MERGEFORMAT </w:instrText>
+            </w:r>
+            <w:r>
+              <w:rPr>
+                <w:b/>
+                <w:sz w:val="32"/>
+              </w:rPr>
+              <w:fldChar w:fldCharType="separate"/>
+            </w:r>
+            <w:r>
+              <w:rPr>
+                <w:b/>
+                <w:noProof/>
+                <w:sz w:val="32"/>
+              </w:rPr>
+              <w:t>2026</w:t>
+            </w:r>
+            <w:r>
+              <w:rPr>
+                <w:b/>
+                <w:sz w:val="32"/>
+              </w:rPr>
+              <w:fldChar w:fldCharType="end"/>
+            </w:r>
+          </w:p>
+        </w:tc>
+        <w:tc>
+          <w:tcPr>
+            <w:tcW w:w="3800" w:type="pct"/>
+            <w:vAlign w:val="bottom"/>
+          </w:tcPr>
+          <w:p>
+            <w:pPr>
+              <w:spacing w:line="259" w:lineRule="auto"/>
+              <w:jc w:val="right"/>
+              <w:rPr>
+                <w:b/>
+                <w:sz w:val="32"/>
+              </w:rPr>
+            </w:pPr>
+            <w:r>
+              <w:rPr>
+                <w:b/>
+                <w:sz w:val="32"/>
+              </w:rPr>
+              <w:t xml:space="preserve">Bc. Alexandra </w:t>
+            </w:r>
+            <w:proofErr w:type="spellStart"/>
+            <w:r>
+              <w:rPr>
+                <w:b/>
+                <w:sz w:val="32"/>
+              </w:rPr>
+              <w:t>Domonkošová</w:t>
+            </w:r>
+            <w:proofErr w:type="spellEnd"/>
+            <w:r>
+              <w:rPr>
+                <w:b/>
+                <w:sz w:val="32"/>
+              </w:rPr>
+              <w:t xml:space="preserve">,                                   Bc. Kristína Gvozdiaková,                                              Bc. Alžbeta </w:t>
+            </w:r>
+            <w:proofErr w:type="spellStart"/>
+            <w:r>
+              <w:rPr>
+                <w:b/>
+                <w:sz w:val="32"/>
+              </w:rPr>
+              <w:t>Jakšová</w:t>
+            </w:r>
+            <w:proofErr w:type="spellEnd"/>
+          </w:p>
+        </w:tc>
+      </w:tr>
+    </w:tbl>
+    <w:p>
+      <w:pPr>
+        <w:pStyle w:val="Nadpis1"/>
         <w:rPr>
           <w:sz w:val="36"/>
           <w:szCs w:val="36"/>
@@ -15,37 +258,17 @@
           <w:sz w:val="36"/>
           <w:szCs w:val="36"/>
         </w:rPr>
-        <w:t xml:space="preserve">Detekcia potravinových rizík </w:t>
-      </w:r>
-    </w:p>
-    <w:p>
-      <w:pPr>
-        <w:pStyle w:val="Nzov"/>
-        <w:rPr>
-          <w:sz w:val="32"/>
-          <w:szCs w:val="32"/>
-        </w:rPr>
-      </w:pPr>
-      <w:r>
-        <w:rPr>
-          <w:sz w:val="32"/>
-          <w:szCs w:val="32"/>
-        </w:rPr>
+        <w:br w:type="page"/>
+      </w:r>
+      <w:r>
+        <w:lastRenderedPageBreak/>
         <w:t>N</w:t>
       </w:r>
       <w:r>
-        <w:rPr>
-          <w:sz w:val="32"/>
-          <w:szCs w:val="32"/>
-        </w:rPr>
         <w:t xml:space="preserve">ávrh riešenia a </w:t>
       </w:r>
       <w:proofErr w:type="spellStart"/>
       <w:r>
-        <w:rPr>
-          <w:sz w:val="32"/>
-          <w:szCs w:val="32"/>
-        </w:rPr>
         <w:t>baseline</w:t>
       </w:r>
       <w:proofErr w:type="spellEnd"/>
@@ -7198,7 +7421,6 @@
                 <w:sz w:val="19"/>
                 <w:szCs w:val="19"/>
               </w:rPr>
-              <w:lastRenderedPageBreak/>
               <w:t>Macro-F1 ako metrika</w:t>
             </w:r>
           </w:p>
@@ -11953,7 +12175,13 @@
         <w:jc w:val="both"/>
       </w:pPr>
       <w:r>
-        <w:t>Poznámka: 20 chýb nie je reprezentatívna vzorka, ide o ručne vybrané ukážky. Pomery v tabuľke preto neinterpretujeme ako podiely všetkých chýb.</w:t>
+        <w:t xml:space="preserve">Poznámka: </w:t>
+      </w:r>
+      <w:r>
+        <w:t>20 chýb je malá náhodná vzorka</w:t>
+      </w:r>
+      <w:r>
+        <w:t>. Pomery v tabuľke preto neinterpretujeme ako podiely všetkých chýb.</w:t>
       </w:r>
     </w:p>
     <w:p>
@@ -14433,7 +14661,9 @@
       <w:footerReference w:type="default" r:id="rId14"/>
       <w:pgSz w:w="11906" w:h="16838"/>
       <w:pgMar w:top="1440" w:right="1440" w:bottom="1440" w:left="1440" w:header="708" w:footer="708" w:gutter="0"/>
+      <w:pgNumType w:start="0"/>
       <w:cols w:space="708"/>
+      <w:titlePg/>
       <w:docGrid w:linePitch="360"/>
     </w:sectPr>
   </w:body>
@@ -15478,6 +15708,26 @@
     <w:uiPriority w:val="99"/>
     <w:rsid w:val="00B55602"/>
   </w:style>
+  <w:style w:type="table" w:styleId="Mriekatabuky">
+    <w:name w:val="Table Grid"/>
+    <w:basedOn w:val="Normlnatabuka"/>
+    <w:uiPriority w:val="39"/>
+    <w:rsid w:val="000B7F5E"/>
+    <w:rPr>
+      <w:rFonts w:cs="Times New Roman"/>
+      <w:lang w:eastAsia="en-US"/>
+    </w:rPr>
+    <w:tblPr>
+      <w:tblBorders>
+        <w:top w:val="single" w:sz="4" w:space="0" w:color="auto"/>
+        <w:left w:val="single" w:sz="4" w:space="0" w:color="auto"/>
+        <w:bottom w:val="single" w:sz="4" w:space="0" w:color="auto"/>
+        <w:right w:val="single" w:sz="4" w:space="0" w:color="auto"/>
+        <w:insideH w:val="single" w:sz="4" w:space="0" w:color="auto"/>
+        <w:insideV w:val="single" w:sz="4" w:space="0" w:color="auto"/>
+      </w:tblBorders>
+    </w:tblPr>
+  </w:style>
 </w:styles>
 </file>
 

</xml_diff>